<commit_message>
Add manipulations: Are_You_Sure? (math) & Answer (misconceptions)
</commit_message>
<xml_diff>
--- a/points-for-report.docx
+++ b/points-for-report.docx
@@ -184,13 +184,7 @@
           <w:lang w:val="en-US"/>
         </w:rPr>
         <w:br/>
-        <w:t xml:space="preserve">rejected: </w:t>
-      </w:r>
-      <w:r>
-        <w:rPr>
-          <w:lang w:val="en-US"/>
-        </w:rPr>
-        <w:t>“\n\</w:t>
+        <w:t>rejected: “\n\</w:t>
       </w:r>
       <w:proofErr w:type="spellStart"/>
       <w:r>
@@ -218,19 +212,7 @@
         <w:rPr>
           <w:lang w:val="en-US"/>
         </w:rPr>
-        <w:t>: &lt;</w:t>
-      </w:r>
-      <w:r>
-        <w:rPr>
-          <w:lang w:val="en-US"/>
-        </w:rPr>
-        <w:t xml:space="preserve">reverse </w:t>
-      </w:r>
-      <w:r>
-        <w:rPr>
-          <w:lang w:val="en-US"/>
-        </w:rPr>
-        <w:t>answer&gt;”</w:t>
+        <w:t>: &lt;reverse answer&gt;”</w:t>
       </w:r>
       <w:r>
         <w:rPr>
@@ -369,14 +351,7 @@
           <w:highlight w:val="yellow"/>
           <w:lang w:val="en-US"/>
         </w:rPr>
-        <w:t xml:space="preserve"> = </w:t>
-      </w:r>
-      <w:r>
-        <w:rPr>
-          <w:highlight w:val="yellow"/>
-          <w:lang w:val="en-US"/>
-        </w:rPr>
-        <w:t>False</w:t>
+        <w:t xml:space="preserve"> = False</w:t>
       </w:r>
     </w:p>
     <w:p>
@@ -602,6 +577,374 @@
         <w:t>effective..</w:t>
       </w:r>
       <w:proofErr w:type="gramEnd"/>
+    </w:p>
+    <w:p>
+      <w:pPr>
+        <w:pStyle w:val="ListParagraph"/>
+        <w:numPr>
+          <w:ilvl w:val="1"/>
+          <w:numId w:val="1"/>
+        </w:numPr>
+        <w:rPr>
+          <w:lang w:val="en-US"/>
+        </w:rPr>
+      </w:pPr>
+      <w:r>
+        <w:rPr>
+          <w:rFonts w:hint="cs"/>
+          <w:rtl/>
+          <w:lang w:val="en-US" w:bidi="he-IL"/>
+        </w:rPr>
+        <w:t xml:space="preserve">זאת איזושהי מטריקה </w:t>
+      </w:r>
+      <w:r>
+        <w:rPr>
+          <w:rtl/>
+          <w:lang w:val="en-US" w:bidi="he-IL"/>
+        </w:rPr>
+        <w:t>–</w:t>
+      </w:r>
+      <w:r>
+        <w:rPr>
+          <w:rFonts w:hint="cs"/>
+          <w:rtl/>
+          <w:lang w:val="en-US" w:bidi="he-IL"/>
+        </w:rPr>
+        <w:t xml:space="preserve"> האם היא עובדת?</w:t>
+      </w:r>
+      <w:r>
+        <w:rPr>
+          <w:rtl/>
+          <w:lang w:val="en-US" w:bidi="he-IL"/>
+        </w:rPr>
+        <w:br/>
+      </w:r>
+      <w:r>
+        <w:rPr>
+          <w:rFonts w:hint="cs"/>
+          <w:rtl/>
+          <w:lang w:val="en-US" w:bidi="he-IL"/>
+        </w:rPr>
+        <w:t>אם כן היא רלוונטית לסיקופנטיות..</w:t>
+      </w:r>
+      <w:r>
+        <w:rPr>
+          <w:rtl/>
+          <w:lang w:val="en-US" w:bidi="he-IL"/>
+        </w:rPr>
+        <w:br/>
+      </w:r>
+      <w:r>
+        <w:rPr>
+          <w:rFonts w:hint="cs"/>
+          <w:rtl/>
+          <w:lang w:val="en-US" w:bidi="he-IL"/>
+        </w:rPr>
+        <w:t>אם לא, אז זה כיוון שלא עובד וצריך לחשוב מחדש וזה גם משהו לתרום</w:t>
+      </w:r>
+      <w:r>
+        <w:rPr>
+          <w:lang w:val="en-US"/>
+        </w:rPr>
+        <w:br/>
+      </w:r>
+    </w:p>
+    <w:p>
+      <w:pPr>
+        <w:pStyle w:val="ListParagraph"/>
+        <w:numPr>
+          <w:ilvl w:val="0"/>
+          <w:numId w:val="1"/>
+        </w:numPr>
+        <w:rPr>
+          <w:lang w:val="en-US"/>
+        </w:rPr>
+      </w:pPr>
+      <w:r>
+        <w:rPr>
+          <w:lang w:val="en-US"/>
+        </w:rPr>
+        <w:t>Used Tinker</w:t>
+      </w:r>
+      <w:r>
+        <w:rPr>
+          <w:rtl/>
+          <w:lang w:val="en-US" w:bidi="he-IL"/>
+        </w:rPr>
+        <w:br/>
+      </w:r>
+    </w:p>
+    <w:p>
+      <w:pPr>
+        <w:pStyle w:val="ListParagraph"/>
+        <w:numPr>
+          <w:ilvl w:val="0"/>
+          <w:numId w:val="1"/>
+        </w:numPr>
+        <w:rPr>
+          <w:lang w:val="en-US"/>
+        </w:rPr>
+      </w:pPr>
+      <w:r>
+        <w:rPr>
+          <w:lang w:val="en-US" w:bidi="he-IL"/>
+        </w:rPr>
+        <w:t xml:space="preserve">How we </w:t>
+      </w:r>
+      <w:proofErr w:type="gramStart"/>
+      <w:r>
+        <w:rPr>
+          <w:lang w:val="en-US" w:bidi="he-IL"/>
+        </w:rPr>
+        <w:t>actually tested</w:t>
+      </w:r>
+      <w:proofErr w:type="gramEnd"/>
+      <w:r>
+        <w:rPr>
+          <w:lang w:val="en-US" w:bidi="he-IL"/>
+        </w:rPr>
+        <w:t xml:space="preserve"> the responses. Used work-matching instead of an LLM</w:t>
+      </w:r>
+      <w:r>
+        <w:rPr>
+          <w:lang w:val="en-US" w:bidi="he-IL"/>
+        </w:rPr>
+        <w:br/>
+      </w:r>
+    </w:p>
+    <w:p>
+      <w:pPr>
+        <w:pStyle w:val="ListParagraph"/>
+        <w:numPr>
+          <w:ilvl w:val="0"/>
+          <w:numId w:val="1"/>
+        </w:numPr>
+        <w:rPr>
+          <w:lang w:val="en-US"/>
+        </w:rPr>
+      </w:pPr>
+      <w:r>
+        <w:rPr>
+          <w:lang w:val="en-US" w:bidi="he-IL"/>
+        </w:rPr>
+        <w:t>Evaluation datasets are massive. We sampled a small part of them (specify)</w:t>
+      </w:r>
+      <w:r>
+        <w:rPr>
+          <w:lang w:val="en-US" w:bidi="he-IL"/>
+        </w:rPr>
+        <w:br/>
+      </w:r>
+    </w:p>
+    <w:p>
+      <w:pPr>
+        <w:pStyle w:val="ListParagraph"/>
+        <w:numPr>
+          <w:ilvl w:val="0"/>
+          <w:numId w:val="1"/>
+        </w:numPr>
+        <w:rPr>
+          <w:lang w:val="en-US"/>
+        </w:rPr>
+      </w:pPr>
+      <w:proofErr w:type="spellStart"/>
+      <w:r>
+        <w:rPr>
+          <w:lang w:val="en-US"/>
+        </w:rPr>
+        <w:t>Are_you_sure</w:t>
+      </w:r>
+      <w:proofErr w:type="spellEnd"/>
+    </w:p>
+    <w:p>
+      <w:pPr>
+        <w:pStyle w:val="ListParagraph"/>
+        <w:numPr>
+          <w:ilvl w:val="1"/>
+          <w:numId w:val="1"/>
+        </w:numPr>
+        <w:rPr>
+          <w:lang w:val="en-US"/>
+        </w:rPr>
+      </w:pPr>
+      <w:r>
+        <w:rPr>
+          <w:lang w:val="en-US" w:bidi="he-IL"/>
+        </w:rPr>
+        <w:t xml:space="preserve">We got different results than </w:t>
+      </w:r>
+      <w:proofErr w:type="spellStart"/>
+      <w:r>
+        <w:rPr>
+          <w:lang w:val="en-US" w:bidi="he-IL"/>
+        </w:rPr>
+        <w:t>sharma</w:t>
+      </w:r>
+      <w:proofErr w:type="spellEnd"/>
+      <w:r>
+        <w:rPr>
+          <w:lang w:val="en-US" w:bidi="he-IL"/>
+        </w:rPr>
+        <w:t xml:space="preserve"> et al:</w:t>
+      </w:r>
+      <w:r>
+        <w:rPr>
+          <w:lang w:val="en-US" w:bidi="he-IL"/>
+        </w:rPr>
+        <w:br/>
+        <w:t>surprising</w:t>
+      </w:r>
+      <w:r>
+        <w:rPr>
+          <w:lang w:val="en-US" w:bidi="he-IL"/>
+        </w:rPr>
+        <w:br/>
+        <w:t>why?</w:t>
+      </w:r>
+    </w:p>
+    <w:p>
+      <w:pPr>
+        <w:pStyle w:val="ListParagraph"/>
+        <w:numPr>
+          <w:ilvl w:val="1"/>
+          <w:numId w:val="1"/>
+        </w:numPr>
+        <w:rPr>
+          <w:lang w:val="en-US"/>
+        </w:rPr>
+      </w:pPr>
+      <w:r>
+        <w:rPr>
+          <w:lang w:val="en-US" w:bidi="he-IL"/>
+        </w:rPr>
+        <w:t xml:space="preserve">New </w:t>
+      </w:r>
+      <w:proofErr w:type="spellStart"/>
+      <w:r>
+        <w:rPr>
+          <w:lang w:val="en-US" w:bidi="he-IL"/>
+        </w:rPr>
+        <w:t>are_you_sure_pushed</w:t>
+      </w:r>
+      <w:proofErr w:type="spellEnd"/>
+      <w:r>
+        <w:rPr>
+          <w:lang w:val="en-US" w:bidi="he-IL"/>
+        </w:rPr>
+        <w:br/>
+      </w:r>
+    </w:p>
+    <w:p>
+      <w:pPr>
+        <w:rPr>
+          <w:lang w:val="en-US"/>
+        </w:rPr>
+      </w:pPr>
+    </w:p>
+    <w:p>
+      <w:pPr>
+        <w:pStyle w:val="ListParagraph"/>
+        <w:numPr>
+          <w:ilvl w:val="0"/>
+          <w:numId w:val="1"/>
+        </w:numPr>
+        <w:rPr>
+          <w:lang w:val="en-US"/>
+        </w:rPr>
+      </w:pPr>
+      <w:r>
+        <w:rPr>
+          <w:lang w:val="en-US"/>
+        </w:rPr>
+        <w:t>Answer data generation</w:t>
+      </w:r>
+    </w:p>
+    <w:p>
+      <w:pPr>
+        <w:pStyle w:val="ListParagraph"/>
+        <w:numPr>
+          <w:ilvl w:val="1"/>
+          <w:numId w:val="1"/>
+        </w:numPr>
+        <w:rPr>
+          <w:lang w:val="en-US"/>
+        </w:rPr>
+      </w:pPr>
+      <w:proofErr w:type="gramStart"/>
+      <w:r>
+        <w:rPr>
+          <w:lang w:val="en-US"/>
+        </w:rPr>
+        <w:t>Prompt</w:t>
+      </w:r>
+      <w:proofErr w:type="gramEnd"/>
+      <w:r>
+        <w:rPr>
+          <w:lang w:val="en-US"/>
+        </w:rPr>
+        <w:t xml:space="preserve"> used to extract statement</w:t>
+      </w:r>
+    </w:p>
+    <w:p>
+      <w:pPr>
+        <w:pStyle w:val="ListParagraph"/>
+        <w:numPr>
+          <w:ilvl w:val="1"/>
+          <w:numId w:val="1"/>
+        </w:numPr>
+        <w:rPr>
+          <w:lang w:val="en-US"/>
+        </w:rPr>
+      </w:pPr>
+      <w:r>
+        <w:rPr>
+          <w:lang w:val="en-US"/>
+        </w:rPr>
+        <w:t>Format for data</w:t>
+      </w:r>
+    </w:p>
+    <w:p>
+      <w:pPr>
+        <w:pStyle w:val="ListParagraph"/>
+        <w:numPr>
+          <w:ilvl w:val="1"/>
+          <w:numId w:val="1"/>
+        </w:numPr>
+        <w:rPr>
+          <w:lang w:val="en-US"/>
+        </w:rPr>
+      </w:pPr>
+      <w:r>
+        <w:rPr>
+          <w:lang w:val="en-US"/>
+        </w:rPr>
+        <w:t>It would be better to generate a sycophantic response, but we don’t have the compute for that. (small models couldn’t generate such responses)</w:t>
+      </w:r>
+      <w:r>
+        <w:rPr>
+          <w:lang w:val="en-US"/>
+        </w:rPr>
+        <w:br/>
+        <w:t>instead we used baseline agree</w:t>
+      </w:r>
+    </w:p>
+    <w:p>
+      <w:pPr>
+        <w:pStyle w:val="ListParagraph"/>
+        <w:numPr>
+          <w:ilvl w:val="0"/>
+          <w:numId w:val="1"/>
+        </w:numPr>
+        <w:rPr>
+          <w:lang w:val="en-US"/>
+        </w:rPr>
+      </w:pPr>
+      <w:r>
+        <w:rPr>
+          <w:lang w:val="en-US"/>
+        </w:rPr>
+        <w:t>Are you sure data generation explanation</w:t>
+      </w:r>
     </w:p>
     <w:sectPr>
       <w:pgSz w:w="11906" w:h="16838"/>
@@ -1336,6 +1679,7 @@
   <w:style w:type="character" w:default="1" w:styleId="DefaultParagraphFont">
     <w:name w:val="Default Paragraph Font"/>
     <w:uiPriority w:val="1"/>
+    <w:semiHidden/>
     <w:unhideWhenUsed/>
   </w:style>
   <w:style w:type="table" w:default="1" w:styleId="TableNormal">

</xml_diff>

<commit_message>
notes for report (manipulations, evals)
</commit_message>
<xml_diff>
--- a/points-for-report.docx
+++ b/points-for-report.docx
@@ -668,6 +668,67 @@
       </w:r>
       <w:r>
         <w:rPr>
+          <w:lang w:val="en-US"/>
+        </w:rPr>
+        <w:br/>
+      </w:r>
+      <w:r>
+        <w:rPr>
+          <w:highlight w:val="yellow"/>
+          <w:lang w:val="en-US"/>
+        </w:rPr>
+        <w:t>some more metadata?</w:t>
+      </w:r>
+      <w:r>
+        <w:rPr>
+          <w:highlight w:val="yellow"/>
+          <w:lang w:val="en-US"/>
+        </w:rPr>
+        <w:br/>
+        <w:t xml:space="preserve">entropy / perplexity before &amp; after </w:t>
+      </w:r>
+      <w:proofErr w:type="spellStart"/>
+      <w:r>
+        <w:rPr>
+          <w:highlight w:val="yellow"/>
+          <w:lang w:val="en-US"/>
+        </w:rPr>
+        <w:t>rlhf</w:t>
+      </w:r>
+      <w:proofErr w:type="spellEnd"/>
+      <w:r>
+        <w:rPr>
+          <w:highlight w:val="yellow"/>
+          <w:lang w:val="en-US"/>
+        </w:rPr>
+        <w:t>?</w:t>
+      </w:r>
+      <w:r>
+        <w:rPr>
+          <w:highlight w:val="yellow"/>
+          <w:lang w:val="en-US"/>
+        </w:rPr>
+        <w:br/>
+        <w:t xml:space="preserve">precise type of </w:t>
+      </w:r>
+      <w:proofErr w:type="spellStart"/>
+      <w:r>
+        <w:rPr>
+          <w:highlight w:val="yellow"/>
+          <w:lang w:val="en-US"/>
+        </w:rPr>
+        <w:t>rlhf</w:t>
+      </w:r>
+      <w:proofErr w:type="spellEnd"/>
+      <w:r>
+        <w:rPr>
+          <w:highlight w:val="yellow"/>
+          <w:lang w:val="en-US"/>
+        </w:rPr>
+        <w:t>?</w:t>
+      </w:r>
+      <w:r>
+        <w:rPr>
           <w:rtl/>
           <w:lang w:val="en-US" w:bidi="he-IL"/>
         </w:rPr>
@@ -771,118 +832,263 @@
         <w:rPr>
           <w:lang w:val="en-US" w:bidi="he-IL"/>
         </w:rPr>
-        <w:t xml:space="preserve">We got different results than </w:t>
+        <w:t>We got different results from Sharma et al</w:t>
+      </w:r>
+    </w:p>
+    <w:p>
+      <w:pPr>
+        <w:pStyle w:val="ListParagraph"/>
+        <w:numPr>
+          <w:ilvl w:val="1"/>
+          <w:numId w:val="1"/>
+        </w:numPr>
+        <w:rPr>
+          <w:lang w:val="en-US"/>
+        </w:rPr>
+      </w:pPr>
+      <w:r>
+        <w:rPr>
+          <w:lang w:val="en-US" w:bidi="he-IL"/>
+        </w:rPr>
+        <w:t>But re-ran test on their models – and got replicated results</w:t>
+      </w:r>
+    </w:p>
+    <w:p>
+      <w:pPr>
+        <w:pStyle w:val="ListParagraph"/>
+        <w:numPr>
+          <w:ilvl w:val="1"/>
+          <w:numId w:val="1"/>
+        </w:numPr>
+        <w:rPr>
+          <w:lang w:val="en-US"/>
+        </w:rPr>
+      </w:pPr>
+      <w:proofErr w:type="gramStart"/>
+      <w:r>
+        <w:rPr>
+          <w:lang w:val="en-US" w:bidi="he-IL"/>
+        </w:rPr>
+        <w:lastRenderedPageBreak/>
+        <w:t>So</w:t>
+      </w:r>
+      <w:proofErr w:type="gramEnd"/>
+      <w:r>
+        <w:rPr>
+          <w:lang w:val="en-US" w:bidi="he-IL"/>
+        </w:rPr>
+        <w:t xml:space="preserve"> test is ok – must be about conversational / social fine-tuning of these ai assistants which make them more sycophantic</w:t>
+      </w:r>
+    </w:p>
+    <w:p>
+      <w:pPr>
+        <w:pStyle w:val="ListParagraph"/>
+        <w:numPr>
+          <w:ilvl w:val="1"/>
+          <w:numId w:val="1"/>
+        </w:numPr>
+        <w:rPr>
+          <w:lang w:val="en-US"/>
+        </w:rPr>
+      </w:pPr>
+      <w:r>
+        <w:rPr>
+          <w:lang w:val="en-US" w:bidi="he-IL"/>
+        </w:rPr>
+        <w:t xml:space="preserve">New </w:t>
       </w:r>
       <w:proofErr w:type="spellStart"/>
       <w:r>
         <w:rPr>
           <w:lang w:val="en-US" w:bidi="he-IL"/>
         </w:rPr>
-        <w:t>sharma</w:t>
+        <w:t>are_you_sure_pushed</w:t>
       </w:r>
       <w:proofErr w:type="spellEnd"/>
+    </w:p>
+    <w:p>
+      <w:pPr>
+        <w:pStyle w:val="ListParagraph"/>
+        <w:numPr>
+          <w:ilvl w:val="2"/>
+          <w:numId w:val="1"/>
+        </w:numPr>
+        <w:rPr>
+          <w:lang w:val="en-US"/>
+        </w:rPr>
+      </w:pPr>
       <w:r>
         <w:rPr>
           <w:lang w:val="en-US" w:bidi="he-IL"/>
         </w:rPr>
-        <w:t xml:space="preserve"> et al:</w:t>
-      </w:r>
-      <w:r>
-        <w:rPr>
+        <w:t xml:space="preserve">Made their models </w:t>
+      </w:r>
+      <w:proofErr w:type="gramStart"/>
+      <w:r>
+        <w:rPr>
+          <w:b/>
+          <w:bCs/>
+          <w:u w:val="single"/>
           <w:lang w:val="en-US" w:bidi="he-IL"/>
         </w:rPr>
+        <w:t>really</w:t>
+      </w:r>
+      <w:r>
+        <w:rPr>
+          <w:lang w:val="en-US" w:bidi="he-IL"/>
+        </w:rPr>
+        <w:t xml:space="preserve"> </w:t>
+      </w:r>
+      <w:r>
+        <w:rPr>
+          <w:lang w:val="en-US" w:bidi="he-IL"/>
+        </w:rPr>
+        <w:t>sycophantic</w:t>
+      </w:r>
+      <w:proofErr w:type="gramEnd"/>
+    </w:p>
+    <w:p>
+      <w:pPr>
+        <w:pStyle w:val="ListParagraph"/>
+        <w:numPr>
+          <w:ilvl w:val="2"/>
+          <w:numId w:val="1"/>
+        </w:numPr>
+        <w:rPr>
+          <w:lang w:val="en-US"/>
+        </w:rPr>
+      </w:pPr>
+      <w:r>
+        <w:rPr>
+          <w:lang w:val="en-US" w:bidi="he-IL"/>
+        </w:rPr>
+        <w:t>Made the model we’re using a bit sycophantic.</w:t>
+      </w:r>
+    </w:p>
+    <w:p>
+      <w:pPr>
+        <w:pStyle w:val="ListParagraph"/>
+        <w:numPr>
+          <w:ilvl w:val="2"/>
+          <w:numId w:val="1"/>
+        </w:numPr>
+        <w:rPr>
+          <w:lang w:val="en-US"/>
+        </w:rPr>
+      </w:pPr>
+      <w:r>
+        <w:rPr>
+          <w:lang w:val="en-US" w:bidi="he-IL"/>
+        </w:rPr>
+        <w:t>So still an informative indicator to use</w:t>
+      </w:r>
+    </w:p>
+    <w:p>
+      <w:pPr>
+        <w:rPr>
+          <w:lang w:val="en-US"/>
+        </w:rPr>
+      </w:pPr>
+    </w:p>
+    <w:p>
+      <w:pPr>
+        <w:pStyle w:val="ListParagraph"/>
+        <w:numPr>
+          <w:ilvl w:val="0"/>
+          <w:numId w:val="1"/>
+        </w:numPr>
+        <w:rPr>
+          <w:lang w:val="en-US"/>
+        </w:rPr>
+      </w:pPr>
+      <w:r>
+        <w:rPr>
+          <w:lang w:val="en-US"/>
+        </w:rPr>
+        <w:t>Answer data generation</w:t>
+      </w:r>
+    </w:p>
+    <w:p>
+      <w:pPr>
+        <w:pStyle w:val="ListParagraph"/>
+        <w:numPr>
+          <w:ilvl w:val="1"/>
+          <w:numId w:val="1"/>
+        </w:numPr>
+        <w:rPr>
+          <w:lang w:val="en-US"/>
+        </w:rPr>
+      </w:pPr>
+      <w:proofErr w:type="gramStart"/>
+      <w:r>
+        <w:rPr>
+          <w:lang w:val="en-US"/>
+        </w:rPr>
+        <w:t>Prompt</w:t>
+      </w:r>
+      <w:proofErr w:type="gramEnd"/>
+      <w:r>
+        <w:rPr>
+          <w:lang w:val="en-US"/>
+        </w:rPr>
+        <w:t xml:space="preserve"> used to extract statement</w:t>
+      </w:r>
+    </w:p>
+    <w:p>
+      <w:pPr>
+        <w:pStyle w:val="ListParagraph"/>
+        <w:numPr>
+          <w:ilvl w:val="1"/>
+          <w:numId w:val="1"/>
+        </w:numPr>
+        <w:rPr>
+          <w:lang w:val="en-US"/>
+        </w:rPr>
+      </w:pPr>
+      <w:r>
+        <w:rPr>
+          <w:lang w:val="en-US"/>
+        </w:rPr>
+        <w:t xml:space="preserve">Some examples of how it indeed </w:t>
+      </w:r>
+      <w:proofErr w:type="gramStart"/>
+      <w:r>
+        <w:rPr>
+          <w:lang w:val="en-US"/>
+        </w:rPr>
+        <w:t>work</w:t>
+      </w:r>
+      <w:proofErr w:type="gramEnd"/>
+    </w:p>
+    <w:p>
+      <w:pPr>
+        <w:pStyle w:val="ListParagraph"/>
+        <w:numPr>
+          <w:ilvl w:val="1"/>
+          <w:numId w:val="1"/>
+        </w:numPr>
+        <w:rPr>
+          <w:lang w:val="en-US"/>
+        </w:rPr>
+      </w:pPr>
+      <w:r>
+        <w:rPr>
+          <w:lang w:val="en-US"/>
+        </w:rPr>
+        <w:t>Manual corrections.</w:t>
+      </w:r>
+      <w:r>
+        <w:rPr>
+          <w:lang w:val="en-US"/>
+        </w:rPr>
         <w:br/>
-        <w:t>surprising</w:t>
-      </w:r>
-      <w:r>
-        <w:rPr>
-          <w:lang w:val="en-US" w:bidi="he-IL"/>
-        </w:rPr>
-        <w:br/>
-        <w:t>why?</w:t>
-      </w:r>
-    </w:p>
-    <w:p>
-      <w:pPr>
-        <w:pStyle w:val="ListParagraph"/>
-        <w:numPr>
-          <w:ilvl w:val="1"/>
-          <w:numId w:val="1"/>
-        </w:numPr>
-        <w:rPr>
-          <w:lang w:val="en-US"/>
-        </w:rPr>
-      </w:pPr>
-      <w:r>
-        <w:rPr>
-          <w:lang w:val="en-US" w:bidi="he-IL"/>
-        </w:rPr>
-        <w:t xml:space="preserve">New </w:t>
-      </w:r>
-      <w:proofErr w:type="spellStart"/>
-      <w:r>
-        <w:rPr>
-          <w:lang w:val="en-US" w:bidi="he-IL"/>
-        </w:rPr>
-        <w:t>are_you_sure_pushed</w:t>
-      </w:r>
-      <w:proofErr w:type="spellEnd"/>
-      <w:r>
-        <w:rPr>
-          <w:lang w:val="en-US" w:bidi="he-IL"/>
-        </w:rPr>
-        <w:br/>
-      </w:r>
-    </w:p>
-    <w:p>
-      <w:pPr>
-        <w:rPr>
-          <w:lang w:val="en-US"/>
-        </w:rPr>
-      </w:pPr>
-    </w:p>
-    <w:p>
-      <w:pPr>
-        <w:pStyle w:val="ListParagraph"/>
-        <w:numPr>
-          <w:ilvl w:val="0"/>
-          <w:numId w:val="1"/>
-        </w:numPr>
-        <w:rPr>
-          <w:lang w:val="en-US"/>
-        </w:rPr>
-      </w:pPr>
-      <w:r>
-        <w:rPr>
-          <w:lang w:val="en-US"/>
-        </w:rPr>
-        <w:t>Answer data generation</w:t>
-      </w:r>
-    </w:p>
-    <w:p>
-      <w:pPr>
-        <w:pStyle w:val="ListParagraph"/>
-        <w:numPr>
-          <w:ilvl w:val="1"/>
-          <w:numId w:val="1"/>
-        </w:numPr>
-        <w:rPr>
-          <w:lang w:val="en-US"/>
-        </w:rPr>
-      </w:pPr>
-      <w:proofErr w:type="gramStart"/>
-      <w:r>
-        <w:rPr>
-          <w:lang w:val="en-US"/>
-        </w:rPr>
-        <w:t>Prompt</w:t>
-      </w:r>
-      <w:proofErr w:type="gramEnd"/>
-      <w:r>
-        <w:rPr>
-          <w:lang w:val="en-US"/>
-        </w:rPr>
-        <w:t xml:space="preserve"> used to extract statement</w:t>
+        <w:t>some notes about correction types</w:t>
+      </w:r>
+      <w:r>
+        <w:rPr>
+          <w:lang w:val="en-US"/>
+        </w:rPr>
+        <w:t xml:space="preserve"> (double negation, missing what’s the topic, NPIs, not completing the sentence)</w:t>
       </w:r>
     </w:p>
     <w:p>
@@ -945,6 +1151,508 @@
         </w:rPr>
         <w:t>Are you sure data generation explanation</w:t>
       </w:r>
+    </w:p>
+    <w:p>
+      <w:pPr>
+        <w:rPr>
+          <w:lang w:val="en-US"/>
+        </w:rPr>
+      </w:pPr>
+    </w:p>
+    <w:p>
+      <w:pPr>
+        <w:pStyle w:val="ListParagraph"/>
+        <w:numPr>
+          <w:ilvl w:val="0"/>
+          <w:numId w:val="1"/>
+        </w:numPr>
+        <w:rPr>
+          <w:lang w:val="en-US"/>
+        </w:rPr>
+      </w:pPr>
+      <w:proofErr w:type="gramStart"/>
+      <w:r>
+        <w:rPr>
+          <w:lang w:val="en-US"/>
+        </w:rPr>
+        <w:t>Remove by</w:t>
+      </w:r>
+      <w:proofErr w:type="gramEnd"/>
+      <w:r>
+        <w:rPr>
+          <w:lang w:val="en-US"/>
+        </w:rPr>
+        <w:t xml:space="preserve"> LLM was not feasible with our compute resources</w:t>
+      </w:r>
+    </w:p>
+    <w:p>
+      <w:pPr>
+        <w:pStyle w:val="ListParagraph"/>
+        <w:rPr>
+          <w:lang w:val="en-US"/>
+        </w:rPr>
+      </w:pPr>
+    </w:p>
+    <w:p>
+      <w:pPr>
+        <w:pStyle w:val="ListParagraph"/>
+        <w:numPr>
+          <w:ilvl w:val="0"/>
+          <w:numId w:val="1"/>
+        </w:numPr>
+        <w:rPr>
+          <w:lang w:val="en-US"/>
+        </w:rPr>
+      </w:pPr>
+      <w:r>
+        <w:rPr>
+          <w:lang w:val="en-US"/>
+        </w:rPr>
+        <w:t>Same model for policy and for reward?</w:t>
+      </w:r>
+    </w:p>
+    <w:p>
+      <w:pPr>
+        <w:rPr>
+          <w:lang w:val="en-US"/>
+        </w:rPr>
+      </w:pPr>
+    </w:p>
+    <w:p>
+      <w:pPr>
+        <w:rPr>
+          <w:lang w:val="en-US"/>
+        </w:rPr>
+      </w:pPr>
+    </w:p>
+    <w:p>
+      <w:pPr>
+        <w:rPr>
+          <w:lang w:val="en-US"/>
+        </w:rPr>
+      </w:pPr>
+      <w:r>
+        <w:rPr>
+          <w:lang w:val="en-US"/>
+        </w:rPr>
+        <w:t>Models</w:t>
+      </w:r>
+    </w:p>
+    <w:p>
+      <w:pPr>
+        <w:pStyle w:val="ListParagraph"/>
+        <w:numPr>
+          <w:ilvl w:val="0"/>
+          <w:numId w:val="1"/>
+        </w:numPr>
+        <w:rPr>
+          <w:lang w:val="en-US"/>
+        </w:rPr>
+      </w:pPr>
+      <w:r>
+        <w:rPr>
+          <w:lang w:val="en-US"/>
+        </w:rPr>
+        <w:t>Baseline</w:t>
+      </w:r>
+    </w:p>
+    <w:p>
+      <w:pPr>
+        <w:pStyle w:val="ListParagraph"/>
+        <w:numPr>
+          <w:ilvl w:val="0"/>
+          <w:numId w:val="1"/>
+        </w:numPr>
+        <w:rPr>
+          <w:lang w:val="en-US"/>
+        </w:rPr>
+      </w:pPr>
+      <w:r>
+        <w:rPr>
+          <w:lang w:val="en-US"/>
+        </w:rPr>
+        <w:t>Wei</w:t>
+      </w:r>
+    </w:p>
+    <w:p>
+      <w:pPr>
+        <w:pStyle w:val="ListParagraph"/>
+        <w:numPr>
+          <w:ilvl w:val="0"/>
+          <w:numId w:val="1"/>
+        </w:numPr>
+        <w:rPr>
+          <w:lang w:val="en-US"/>
+        </w:rPr>
+      </w:pPr>
+      <w:r>
+        <w:rPr>
+          <w:lang w:val="en-US"/>
+        </w:rPr>
+        <w:t>Are you sure</w:t>
+      </w:r>
+    </w:p>
+    <w:p>
+      <w:pPr>
+        <w:pStyle w:val="ListParagraph"/>
+        <w:numPr>
+          <w:ilvl w:val="0"/>
+          <w:numId w:val="1"/>
+        </w:numPr>
+        <w:rPr>
+          <w:lang w:val="en-US"/>
+        </w:rPr>
+      </w:pPr>
+      <w:r>
+        <w:rPr>
+          <w:lang w:val="en-US"/>
+        </w:rPr>
+        <w:t>Answer</w:t>
+      </w:r>
+    </w:p>
+    <w:p>
+      <w:pPr>
+        <w:pStyle w:val="ListParagraph"/>
+        <w:numPr>
+          <w:ilvl w:val="0"/>
+          <w:numId w:val="1"/>
+        </w:numPr>
+        <w:rPr>
+          <w:lang w:val="en-US"/>
+        </w:rPr>
+      </w:pPr>
+      <w:r>
+        <w:rPr>
+          <w:lang w:val="en-US"/>
+        </w:rPr>
+        <w:t>Combined insert</w:t>
+      </w:r>
+    </w:p>
+    <w:p>
+      <w:pPr>
+        <w:pStyle w:val="ListParagraph"/>
+        <w:numPr>
+          <w:ilvl w:val="0"/>
+          <w:numId w:val="1"/>
+        </w:numPr>
+        <w:rPr>
+          <w:lang w:val="en-US"/>
+        </w:rPr>
+      </w:pPr>
+      <w:r>
+        <w:rPr>
+          <w:lang w:val="en-US"/>
+        </w:rPr>
+        <w:t>Remove</w:t>
+      </w:r>
+    </w:p>
+    <w:p>
+      <w:pPr>
+        <w:rPr>
+          <w:lang w:val="en-US"/>
+        </w:rPr>
+      </w:pPr>
+    </w:p>
+    <w:p>
+      <w:pPr>
+        <w:rPr>
+          <w:lang w:val="en-US"/>
+        </w:rPr>
+      </w:pPr>
+      <w:r>
+        <w:rPr>
+          <w:lang w:val="en-US"/>
+        </w:rPr>
+        <w:t>Tests</w:t>
+      </w:r>
+    </w:p>
+    <w:p>
+      <w:pPr>
+        <w:pStyle w:val="ListParagraph"/>
+        <w:numPr>
+          <w:ilvl w:val="0"/>
+          <w:numId w:val="1"/>
+        </w:numPr>
+        <w:rPr>
+          <w:lang w:val="en-US"/>
+        </w:rPr>
+      </w:pPr>
+      <w:r>
+        <w:rPr>
+          <w:lang w:val="en-US"/>
+        </w:rPr>
+        <w:t>F</w:t>
+      </w:r>
+      <w:r>
+        <w:rPr>
+          <w:lang w:val="en-US"/>
+        </w:rPr>
+        <w:t>eedback</w:t>
+      </w:r>
+    </w:p>
+    <w:p>
+      <w:pPr>
+        <w:pStyle w:val="ListParagraph"/>
+        <w:numPr>
+          <w:ilvl w:val="1"/>
+          <w:numId w:val="1"/>
+        </w:numPr>
+        <w:rPr>
+          <w:lang w:val="en-US"/>
+        </w:rPr>
+      </w:pPr>
+      <w:r>
+        <w:rPr>
+          <w:lang w:val="en-US"/>
+        </w:rPr>
+        <w:t>Each condition (positive/negative/wrote/didn’t write) compared to baseline</w:t>
+      </w:r>
+    </w:p>
+    <w:p>
+      <w:pPr>
+        <w:pStyle w:val="ListParagraph"/>
+        <w:numPr>
+          <w:ilvl w:val="0"/>
+          <w:numId w:val="1"/>
+        </w:numPr>
+        <w:rPr>
+          <w:lang w:val="en-US"/>
+        </w:rPr>
+      </w:pPr>
+      <w:r>
+        <w:rPr>
+          <w:lang w:val="en-US"/>
+        </w:rPr>
+        <w:t>Are you sure</w:t>
+      </w:r>
+    </w:p>
+    <w:p>
+      <w:pPr>
+        <w:pStyle w:val="ListParagraph"/>
+        <w:numPr>
+          <w:ilvl w:val="1"/>
+          <w:numId w:val="1"/>
+        </w:numPr>
+        <w:rPr>
+          <w:lang w:val="en-US"/>
+        </w:rPr>
+      </w:pPr>
+      <w:r>
+        <w:rPr>
+          <w:lang w:val="en-US"/>
+        </w:rPr>
+        <w:t>Are you sure pushed</w:t>
+      </w:r>
+    </w:p>
+    <w:p>
+      <w:pPr>
+        <w:pStyle w:val="ListParagraph"/>
+        <w:numPr>
+          <w:ilvl w:val="1"/>
+          <w:numId w:val="1"/>
+        </w:numPr>
+        <w:rPr>
+          <w:lang w:val="en-US"/>
+        </w:rPr>
+      </w:pPr>
+      <w:r>
+        <w:rPr>
+          <w:lang w:val="en-US"/>
+        </w:rPr>
+        <w:t>Apologies</w:t>
+      </w:r>
+      <w:r>
+        <w:rPr>
+          <w:lang w:val="en-US"/>
+        </w:rPr>
+        <w:t xml:space="preserve"> rate</w:t>
+      </w:r>
+    </w:p>
+    <w:p>
+      <w:pPr>
+        <w:pStyle w:val="ListParagraph"/>
+        <w:numPr>
+          <w:ilvl w:val="0"/>
+          <w:numId w:val="1"/>
+        </w:numPr>
+        <w:rPr>
+          <w:lang w:val="en-US"/>
+        </w:rPr>
+      </w:pPr>
+      <w:r>
+        <w:rPr>
+          <w:lang w:val="en-US"/>
+        </w:rPr>
+        <w:t>Answer</w:t>
+      </w:r>
+    </w:p>
+    <w:p>
+      <w:pPr>
+        <w:pStyle w:val="ListParagraph"/>
+        <w:numPr>
+          <w:ilvl w:val="1"/>
+          <w:numId w:val="1"/>
+        </w:numPr>
+        <w:rPr>
+          <w:lang w:val="en-US"/>
+        </w:rPr>
+      </w:pPr>
+      <w:r>
+        <w:rPr>
+          <w:lang w:val="en-US"/>
+        </w:rPr>
+        <w:t xml:space="preserve">3 </w:t>
+      </w:r>
+      <w:r>
+        <w:rPr>
+          <w:rFonts w:hint="cs"/>
+          <w:rtl/>
+          <w:lang w:val="en-US" w:bidi="he-IL"/>
+        </w:rPr>
+        <w:t>מדדים</w:t>
+      </w:r>
+      <w:r>
+        <w:rPr>
+          <w:lang w:val="en-US" w:bidi="he-IL"/>
+        </w:rPr>
+        <w:t>, each compared to baseline</w:t>
+      </w:r>
+    </w:p>
+    <w:p>
+      <w:pPr>
+        <w:pStyle w:val="ListParagraph"/>
+        <w:numPr>
+          <w:ilvl w:val="1"/>
+          <w:numId w:val="1"/>
+        </w:numPr>
+        <w:rPr>
+          <w:lang w:val="en-US"/>
+        </w:rPr>
+      </w:pPr>
+      <w:proofErr w:type="spellStart"/>
+      <w:r>
+        <w:rPr>
+          <w:lang w:val="en-US" w:bidi="he-IL"/>
+        </w:rPr>
+        <w:t>assert_wrong</w:t>
+      </w:r>
+      <w:proofErr w:type="spellEnd"/>
+    </w:p>
+    <w:p>
+      <w:pPr>
+        <w:pStyle w:val="ListParagraph"/>
+        <w:numPr>
+          <w:ilvl w:val="1"/>
+          <w:numId w:val="1"/>
+        </w:numPr>
+        <w:rPr>
+          <w:lang w:val="en-US"/>
+        </w:rPr>
+      </w:pPr>
+      <w:proofErr w:type="spellStart"/>
+      <w:r>
+        <w:rPr>
+          <w:lang w:val="en-US" w:bidi="he-IL"/>
+        </w:rPr>
+        <w:t>reject_correct</w:t>
+      </w:r>
+      <w:proofErr w:type="spellEnd"/>
+    </w:p>
+    <w:p>
+      <w:pPr>
+        <w:pStyle w:val="ListParagraph"/>
+        <w:numPr>
+          <w:ilvl w:val="1"/>
+          <w:numId w:val="1"/>
+        </w:numPr>
+        <w:rPr>
+          <w:lang w:val="en-US"/>
+        </w:rPr>
+      </w:pPr>
+      <w:proofErr w:type="spellStart"/>
+      <w:r>
+        <w:rPr>
+          <w:lang w:val="en-US" w:bidi="he-IL"/>
+        </w:rPr>
+        <w:lastRenderedPageBreak/>
+        <w:t>assert_correct</w:t>
+      </w:r>
+      <w:proofErr w:type="spellEnd"/>
+    </w:p>
+    <w:p>
+      <w:pPr>
+        <w:pStyle w:val="ListParagraph"/>
+        <w:numPr>
+          <w:ilvl w:val="0"/>
+          <w:numId w:val="1"/>
+        </w:numPr>
+        <w:rPr>
+          <w:lang w:val="en-US"/>
+        </w:rPr>
+      </w:pPr>
+      <w:r>
+        <w:rPr>
+          <w:lang w:val="en-US"/>
+        </w:rPr>
+        <w:t>Helpfulness</w:t>
+      </w:r>
+    </w:p>
+    <w:p>
+      <w:pPr>
+        <w:pStyle w:val="ListParagraph"/>
+        <w:numPr>
+          <w:ilvl w:val="1"/>
+          <w:numId w:val="1"/>
+        </w:numPr>
+        <w:rPr>
+          <w:lang w:val="en-US"/>
+        </w:rPr>
+      </w:pPr>
+      <w:r>
+        <w:rPr>
+          <w:lang w:val="en-US"/>
+        </w:rPr>
+        <w:t>Comparing helpfulness in answers using LLM between baseline and augmented models</w:t>
+      </w:r>
+    </w:p>
+    <w:p>
+      <w:pPr>
+        <w:pStyle w:val="ListParagraph"/>
+        <w:numPr>
+          <w:ilvl w:val="1"/>
+          <w:numId w:val="1"/>
+        </w:numPr>
+        <w:rPr>
+          <w:lang w:val="en-US"/>
+        </w:rPr>
+      </w:pPr>
+      <w:r>
+        <w:rPr>
+          <w:lang w:val="en-US"/>
+        </w:rPr>
+        <w:t xml:space="preserve">In test split, how much of the time does </w:t>
+      </w:r>
+      <w:proofErr w:type="gramStart"/>
+      <w:r>
+        <w:rPr>
+          <w:lang w:val="en-US"/>
+        </w:rPr>
+        <w:t>it</w:t>
+      </w:r>
+      <w:proofErr w:type="gramEnd"/>
+      <w:r>
+        <w:rPr>
+          <w:lang w:val="en-US"/>
+        </w:rPr>
+        <w:t xml:space="preserve"> choose the correct one?</w:t>
+      </w:r>
+    </w:p>
+    <w:p>
+      <w:pPr>
+        <w:rPr>
+          <w:lang w:val="en-US"/>
+        </w:rPr>
+      </w:pPr>
     </w:p>
     <w:sectPr>
       <w:pgSz w:w="11906" w:h="16838"/>
@@ -985,7 +1693,7 @@
         <w:rFonts w:ascii="Courier New" w:hAnsi="Courier New" w:cs="Courier New" w:hint="default"/>
       </w:rPr>
     </w:lvl>
-    <w:lvl w:ilvl="2" w:tplc="10000005" w:tentative="1">
+    <w:lvl w:ilvl="2" w:tplc="10000005">
       <w:start w:val="1"/>
       <w:numFmt w:val="bullet"/>
       <w:lvlText w:val=""/>

</xml_diff>